<commit_message>
Cleaned up typo duplicate file
</commit_message>
<xml_diff>
--- a/HLD-Architecture.docx
+++ b/HLD-Architecture.docx
@@ -3,6 +3,148 @@
 <w:document xmlns:wpc="http://schemas.microsoft.com/office/word/2010/wordprocessingCanvas" xmlns:cx="http://schemas.microsoft.com/office/drawing/2014/chartex" xmlns:cx1="http://schemas.microsoft.com/office/drawing/2015/9/8/chartex" xmlns:cx2="http://schemas.microsoft.com/office/drawing/2015/10/21/chartex" xmlns:cx3="http://schemas.microsoft.com/office/drawing/2016/5/9/chartex" xmlns:cx4="http://schemas.microsoft.com/office/drawing/2016/5/10/chartex" xmlns:cx5="http://schemas.microsoft.com/office/drawing/2016/5/11/chartex" xmlns:cx6="http://schemas.microsoft.com/office/drawing/2016/5/12/chartex" xmlns:cx7="http://schemas.microsoft.com/office/drawing/2016/5/13/chartex" xmlns:cx8="http://schemas.microsoft.com/office/drawing/2016/5/14/chartex" xmlns:mc="http://schemas.openxmlformats.org/markup-compatibility/2006" xmlns:aink="http://schemas.microsoft.com/office/drawing/2016/ink" xmlns:am3d="http://schemas.microsoft.com/office/drawing/2017/model3d" xmlns:o="urn:schemas-microsoft-com:office:office" xmlns:r="http://schemas.openxmlformats.org/officeDocument/2006/relationships" xmlns:m="http://schemas.openxmlformats.org/officeDocument/2006/math" xmlns:v="urn:schemas-microsoft-com:vml" xmlns:wp14="http://schemas.microsoft.com/office/word/2010/wordprocessingDrawing" xmlns:wp="http://schemas.openxmlformats.org/drawingml/2006/wordprocessingDrawing" xmlns:w10="urn:schemas-microsoft-com:office:word" xmlns:w="http://schemas.openxmlformats.org/wordprocessingml/2006/main" xmlns:w14="http://schemas.microsoft.com/office/word/2010/wordml" xmlns:w15="http://schemas.microsoft.com/office/word/2012/wordml" xmlns:w16cex="http://schemas.microsoft.com/office/word/2018/wordml/cex" xmlns:w16cid="http://schemas.microsoft.com/office/word/2016/wordml/cid" xmlns:w16="http://schemas.microsoft.com/office/word/2018/wordml" xmlns:w16sdtdh="http://schemas.microsoft.com/office/word/2020/wordml/sdtdatahash" xmlns:w16se="http://schemas.microsoft.com/office/word/2015/wordml/symex" xmlns:wpg="http://schemas.microsoft.com/office/word/2010/wordprocessingGroup" xmlns:wpi="http://schemas.microsoft.com/office/word/2010/wordprocessingInk" xmlns:wne="http://schemas.microsoft.com/office/word/2006/wordml" xmlns:wps="http://schemas.microsoft.com/office/word/2010/wordprocessingShape" mc:Ignorable="w14 w15 w16se w16cid w16 w16cex w16sdtdh wp14">
   <w:body>
     <w:p>
+      <w:r>
+        <w:rPr>
+          <w:noProof/>
+        </w:rPr>
+        <mc:AlternateContent>
+          <mc:Choice Requires="wps">
+            <w:drawing>
+              <wp:anchor distT="45720" distB="45720" distL="114300" distR="114300" simplePos="0" relativeHeight="251663360" behindDoc="0" locked="0" layoutInCell="1" allowOverlap="1" wp14:anchorId="2EAB26BD" wp14:editId="22C51CB2">
+                <wp:simplePos x="0" y="0"/>
+                <wp:positionH relativeFrom="column">
+                  <wp:posOffset>1233170</wp:posOffset>
+                </wp:positionH>
+                <wp:positionV relativeFrom="paragraph">
+                  <wp:posOffset>3415665</wp:posOffset>
+                </wp:positionV>
+                <wp:extent cx="1863090" cy="543560"/>
+                <wp:effectExtent l="0" t="0" r="22860" b="27940"/>
+                <wp:wrapSquare wrapText="bothSides"/>
+                <wp:docPr id="27" name="Text Box 2"/>
+                <wp:cNvGraphicFramePr>
+                  <a:graphicFrameLocks xmlns:a="http://schemas.openxmlformats.org/drawingml/2006/main"/>
+                </wp:cNvGraphicFramePr>
+                <a:graphic xmlns:a="http://schemas.openxmlformats.org/drawingml/2006/main">
+                  <a:graphicData uri="http://schemas.microsoft.com/office/word/2010/wordprocessingShape">
+                    <wps:wsp>
+                      <wps:cNvSpPr txBox="1">
+                        <a:spLocks noChangeArrowheads="1"/>
+                      </wps:cNvSpPr>
+                      <wps:spPr bwMode="auto">
+                        <a:xfrm>
+                          <a:off x="0" y="0"/>
+                          <a:ext cx="1863090" cy="543560"/>
+                        </a:xfrm>
+                        <a:prstGeom prst="rect">
+                          <a:avLst/>
+                        </a:prstGeom>
+                        <a:solidFill>
+                          <a:srgbClr val="FFFFFF"/>
+                        </a:solidFill>
+                        <a:ln w="9525">
+                          <a:solidFill>
+                            <a:srgbClr val="000000"/>
+                          </a:solidFill>
+                          <a:miter lim="800000"/>
+                          <a:headEnd/>
+                          <a:tailEnd/>
+                        </a:ln>
+                      </wps:spPr>
+                      <wps:txbx>
+                        <w:txbxContent>
+                          <w:p>
+                            <w:pPr>
+                              <w:rPr>
+                                <w:b/>
+                                <w:bCs/>
+                              </w:rPr>
+                            </w:pPr>
+                            <w:proofErr w:type="spellStart"/>
+                            <w:r>
+                              <w:rPr>
+                                <w:b/>
+                                <w:bCs/>
+                              </w:rPr>
+                              <w:t>Fargate</w:t>
+                            </w:r>
+                            <w:proofErr w:type="spellEnd"/>
+                            <w:r>
+                              <w:rPr>
+                                <w:b/>
+                                <w:bCs/>
+                              </w:rPr>
+                              <w:t xml:space="preserve"> Task</w:t>
+                            </w:r>
+                          </w:p>
+                          <w:p>
+                            <w:r>
+                              <w:t>vCPU 512/ 1024 memory</w:t>
+                            </w:r>
+                          </w:p>
+                        </w:txbxContent>
+                      </wps:txbx>
+                      <wps:bodyPr rot="0" vert="horz" wrap="square" lIns="91440" tIns="45720" rIns="91440" bIns="45720" anchor="t" anchorCtr="0">
+                        <a:noAutofit/>
+                      </wps:bodyPr>
+                    </wps:wsp>
+                  </a:graphicData>
+                </a:graphic>
+                <wp14:sizeRelH relativeFrom="margin">
+                  <wp14:pctWidth>0</wp14:pctWidth>
+                </wp14:sizeRelH>
+                <wp14:sizeRelV relativeFrom="margin">
+                  <wp14:pctHeight>0</wp14:pctHeight>
+                </wp14:sizeRelV>
+              </wp:anchor>
+            </w:drawing>
+          </mc:Choice>
+          <mc:Fallback>
+            <w:pict>
+              <v:shapetype w14:anchorId="2EAB26BD" id="_x0000_t202" coordsize="21600,21600" o:spt="202" path="m,l,21600r21600,l21600,xe">
+                <v:stroke joinstyle="miter"/>
+                <v:path gradientshapeok="t" o:connecttype="rect"/>
+              </v:shapetype>
+              <v:shape id="Text Box 2" o:spid="_x0000_s1026" type="#_x0000_t202" style="position:absolute;margin-left:97.1pt;margin-top:268.95pt;width:146.7pt;height:42.8pt;z-index:251663360;visibility:visible;mso-wrap-style:square;mso-width-percent:0;mso-height-percent:0;mso-wrap-distance-left:9pt;mso-wrap-distance-top:3.6pt;mso-wrap-distance-right:9pt;mso-wrap-distance-bottom:3.6pt;mso-position-horizontal:absolute;mso-position-horizontal-relative:text;mso-position-vertical:absolute;mso-position-vertical-relative:text;mso-width-percent:0;mso-height-percent:0;mso-width-relative:margin;mso-height-relative:margin;v-text-anchor:top" o:gfxdata="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">
+                <v:textbox>
+                  <w:txbxContent>
+                    <w:p>
+                      <w:pPr>
+                        <w:rPr>
+                          <w:b/>
+                          <w:bCs/>
+                        </w:rPr>
+                      </w:pPr>
+                      <w:proofErr w:type="spellStart"/>
+                      <w:r>
+                        <w:rPr>
+                          <w:b/>
+                          <w:bCs/>
+                        </w:rPr>
+                        <w:t>Fargate</w:t>
+                      </w:r>
+                      <w:proofErr w:type="spellEnd"/>
+                      <w:r>
+                        <w:rPr>
+                          <w:b/>
+                          <w:bCs/>
+                        </w:rPr>
+                        <w:t xml:space="preserve"> Task</w:t>
+                      </w:r>
+                    </w:p>
+                    <w:p>
+                      <w:r>
+                        <w:t>vCPU 512/ 1024 memory</w:t>
+                      </w:r>
+                    </w:p>
+                  </w:txbxContent>
+                </v:textbox>
+                <w10:wrap type="square"/>
+              </v:shape>
+            </w:pict>
+          </mc:Fallback>
+        </mc:AlternateContent>
+      </w:r>
       <w:r>
         <w:rPr>
           <w:noProof/>
@@ -77,11 +219,7 @@
           </mc:Choice>
           <mc:Fallback>
             <w:pict>
-              <v:shapetype w14:anchorId="120C5728" id="_x0000_t202" coordsize="21600,21600" o:spt="202" path="m,l,21600r21600,l21600,xe">
-                <v:stroke joinstyle="miter"/>
-                <v:path gradientshapeok="t" o:connecttype="rect"/>
-              </v:shapetype>
-              <v:shape id="Text Box 2" o:spid="_x0000_s1026" type="#_x0000_t202" style="position:absolute;margin-left:98.25pt;margin-top:118.6pt;width:146.7pt;height:23.05pt;z-index:251661312;visibility:visible;mso-wrap-style:square;mso-width-percent:0;mso-height-percent:0;mso-wrap-distance-left:9pt;mso-wrap-distance-top:3.6pt;mso-wrap-distance-right:9pt;mso-wrap-distance-bottom:3.6pt;mso-position-horizontal:absolute;mso-position-horizontal-relative:text;mso-position-vertical:absolute;mso-position-vertical-relative:text;mso-width-percent:0;mso-height-percent:0;mso-width-relative:margin;mso-height-relative:margin;v-text-anchor:top" o:gfxdata="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">
+              <v:shape w14:anchorId="120C5728" id="_x0000_s1027" type="#_x0000_t202" style="position:absolute;margin-left:98.25pt;margin-top:118.6pt;width:146.7pt;height:23.05pt;z-index:251661312;visibility:visible;mso-wrap-style:square;mso-width-percent:0;mso-height-percent:0;mso-wrap-distance-left:9pt;mso-wrap-distance-top:3.6pt;mso-wrap-distance-right:9pt;mso-wrap-distance-bottom:3.6pt;mso-position-horizontal:absolute;mso-position-horizontal-relative:text;mso-position-vertical:absolute;mso-position-vertical-relative:text;mso-width-percent:0;mso-height-percent:0;mso-width-relative:margin;mso-height-relative:margin;v-text-anchor:top" o:gfxdata="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">
                 <v:textbox>
                   <w:txbxContent>
                     <w:p>
@@ -171,7 +309,7 @@
           </mc:Choice>
           <mc:Fallback>
             <w:pict>
-              <v:shape w14:anchorId="70DB1E12" id="_x0000_s1027" type="#_x0000_t202" style="position:absolute;margin-left:69.25pt;margin-top:77.4pt;width:146.7pt;height:23.05pt;z-index:251659264;visibility:visible;mso-wrap-style:square;mso-width-percent:0;mso-height-percent:0;mso-wrap-distance-left:9pt;mso-wrap-distance-top:3.6pt;mso-wrap-distance-right:9pt;mso-wrap-distance-bottom:3.6pt;mso-position-horizontal:absolute;mso-position-horizontal-relative:text;mso-position-vertical:absolute;mso-position-vertical-relative:text;mso-width-percent:0;mso-height-percent:0;mso-width-relative:margin;mso-height-relative:margin;v-text-anchor:top" o:gfxdata="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">
+              <v:shape w14:anchorId="70DB1E12" id="_x0000_s1028" type="#_x0000_t202" style="position:absolute;margin-left:69.25pt;margin-top:77.4pt;width:146.7pt;height:23.05pt;z-index:251659264;visibility:visible;mso-wrap-style:square;mso-width-percent:0;mso-height-percent:0;mso-wrap-distance-left:9pt;mso-wrap-distance-top:3.6pt;mso-wrap-distance-right:9pt;mso-wrap-distance-bottom:3.6pt;mso-position-horizontal:absolute;mso-position-horizontal-relative:text;mso-position-vertical:absolute;mso-position-vertical-relative:text;mso-width-percent:0;mso-height-percent:0;mso-width-relative:margin;mso-height-relative:margin;v-text-anchor:top" o:gfxdata="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">
                 <v:textbox>
                   <w:txbxContent>
                     <w:p>
@@ -194,7 +332,7 @@
         <mc:AlternateContent>
           <mc:Choice Requires="wpc">
             <w:drawing>
-              <wp:inline distT="0" distB="0" distL="0" distR="0" wp14:anchorId="758D1930" wp14:editId="5031CD9F">
+              <wp:inline distT="0" distB="0" distL="0" distR="0" wp14:anchorId="758D1930" wp14:editId="512A27A1">
                 <wp:extent cx="6465570" cy="8696324"/>
                 <wp:effectExtent l="0" t="0" r="11430" b="0"/>
                 <wp:docPr id="8" name="Canvas 8"/>
@@ -589,7 +727,25 @@
                                     <w14:round/>
                                   </w14:textOutline>
                                 </w:rPr>
-                                <w:t>Port: 8080, localhost</w:t>
+                                <w:t xml:space="preserve">Port: 8080, </w:t>
+                              </w:r>
+                              <w:r>
+                                <w:rPr>
+                                  <w:b/>
+                                  <w:bCs/>
+                                  <w:color w:val="000000" w:themeColor="text1"/>
+                                  <w14:shadow w14:blurRad="38100" w14:dist="19050" w14:dir="2700000" w14:sx="100000" w14:sy="100000" w14:kx="0" w14:ky="0" w14:algn="tl">
+                                    <w14:schemeClr w14:val="dk1">
+                                      <w14:alpha w14:val="60000"/>
+                                    </w14:schemeClr>
+                                  </w14:shadow>
+                                  <w14:textOutline w14:w="0" w14:cap="flat" w14:cmpd="sng" w14:algn="ctr">
+                                    <w14:noFill/>
+                                    <w14:prstDash w14:val="solid"/>
+                                    <w14:round/>
+                                  </w14:textOutline>
+                                </w:rPr>
+                                <w:t>localhost</w:t>
                               </w:r>
                             </w:p>
                           </w:txbxContent>
@@ -780,8 +936,8 @@
                         <wps:cNvSpPr/>
                         <wps:spPr>
                           <a:xfrm>
-                            <a:off x="1295399" y="5874528"/>
-                            <a:ext cx="1828801" cy="744234"/>
+                            <a:off x="1304026" y="5922037"/>
+                            <a:ext cx="1828801" cy="963330"/>
                           </a:xfrm>
                           <a:prstGeom prst="roundRect">
                             <a:avLst/>
@@ -849,8 +1005,8 @@
                         <wps:cNvSpPr/>
                         <wps:spPr>
                           <a:xfrm>
-                            <a:off x="3749153" y="5947517"/>
-                            <a:ext cx="1828800" cy="743585"/>
+                            <a:off x="3749153" y="5947083"/>
+                            <a:ext cx="1828800" cy="919543"/>
                           </a:xfrm>
                           <a:prstGeom prst="roundRect">
                             <a:avLst/>
@@ -894,6 +1050,17 @@
                               </w:pPr>
                               <w:r>
                                 <w:t>SSM for Exec</w:t>
+                              </w:r>
+                              <w:r>
+                                <w:t xml:space="preserve"> </w:t>
+                              </w:r>
+                            </w:p>
+                            <w:p>
+                              <w:pPr>
+                                <w:jc w:val="center"/>
+                              </w:pPr>
+                              <w:r>
+                                <w:t xml:space="preserve">Least </w:t>
                               </w:r>
                             </w:p>
                           </w:txbxContent>
@@ -990,7 +1157,19 @@
                                 <w:rPr>
                                   <w:color w:val="4472C4" w:themeColor="accent1"/>
                                 </w:rPr>
-                                <w:t>taskcount</w:t>
+                                <w:t>task</w:t>
+                              </w:r>
+                              <w:r>
+                                <w:rPr>
+                                  <w:color w:val="4472C4" w:themeColor="accent1"/>
+                                </w:rPr>
+                                <w:t>C</w:t>
+                              </w:r>
+                              <w:r>
+                                <w:rPr>
+                                  <w:color w:val="4472C4" w:themeColor="accent1"/>
+                                </w:rPr>
+                                <w:t>ount</w:t>
                               </w:r>
                               <w:proofErr w:type="spellEnd"/>
                             </w:p>
@@ -1134,6 +1313,42 @@
                         </wps:style>
                         <wps:bodyPr/>
                       </wps:wsp>
+                      <wps:wsp>
+                        <wps:cNvPr id="29" name="Text Box 29"/>
+                        <wps:cNvSpPr txBox="1"/>
+                        <wps:spPr>
+                          <a:xfrm>
+                            <a:off x="4201064" y="5323317"/>
+                            <a:ext cx="588645" cy="248920"/>
+                          </a:xfrm>
+                          <a:prstGeom prst="rect">
+                            <a:avLst/>
+                          </a:prstGeom>
+                          <a:solidFill>
+                            <a:schemeClr val="lt1"/>
+                          </a:solidFill>
+                          <a:ln w="6350">
+                            <a:solidFill>
+                              <a:prstClr val="black"/>
+                            </a:solidFill>
+                          </a:ln>
+                        </wps:spPr>
+                        <wps:txbx>
+                          <w:txbxContent>
+                            <w:p>
+                              <w:r>
+                                <w:t>To RDS</w:t>
+                              </w:r>
+                            </w:p>
+                          </w:txbxContent>
+                        </wps:txbx>
+                        <wps:bodyPr rot="0" spcFirstLastPara="0" vertOverflow="overflow" horzOverflow="overflow" vert="horz" wrap="none" lIns="91440" tIns="45720" rIns="91440" bIns="45720" numCol="1" spcCol="0" rtlCol="0" fromWordArt="0" anchor="t" anchorCtr="0" forceAA="0" compatLnSpc="1">
+                          <a:prstTxWarp prst="textNoShape">
+                            <a:avLst/>
+                          </a:prstTxWarp>
+                          <a:noAutofit/>
+                        </wps:bodyPr>
+                      </wps:wsp>
                     </wpc:wpc>
                   </a:graphicData>
                 </a:graphic>
@@ -1142,7 +1357,7 @@
           </mc:Choice>
           <mc:Fallback>
             <w:pict>
-              <v:group w14:anchorId="758D1930" id="Canvas 8" o:spid="_x0000_s1028" editas="canvas" style="width:509.1pt;height:684.75pt;mso-position-horizontal-relative:char;mso-position-vertical-relative:line" coordsize="64655,86956" o:gfxdata="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">
+              <v:group w14:anchorId="758D1930" id="Canvas 8" o:spid="_x0000_s1029" editas="canvas" style="width:509.1pt;height:684.75pt;mso-position-horizontal-relative:char;mso-position-vertical-relative:line" coordsize="64655,86956" o:gfxdata="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">
                 <v:shapetype id="_x0000_t75" coordsize="21600,21600" o:spt="75" o:preferrelative="t" path="m@4@5l@4@11@9@11@9@5xe" filled="f" stroked="f">
                   <v:stroke joinstyle="miter"/>
                   <v:formulas>
@@ -1162,11 +1377,11 @@
                   <v:path o:extrusionok="f" gradientshapeok="t" o:connecttype="rect"/>
                   <o:lock v:ext="edit" aspectratio="t"/>
                 </v:shapetype>
-                <v:shape id="_x0000_s1029" type="#_x0000_t75" style="position:absolute;width:64655;height:86956;visibility:visible;mso-wrap-style:square" filled="t">
+                <v:shape id="_x0000_s1030" type="#_x0000_t75" style="position:absolute;width:64655;height:86956;visibility:visible;mso-wrap-style:square" filled="t">
                   <v:fill o:detectmouseclick="t"/>
                   <v:path o:connecttype="none"/>
                 </v:shape>
-                <v:roundrect id="Rectangle: Rounded Corners 9" o:spid="_x0000_s1030" style="position:absolute;left:1047;top:9069;width:63608;height:74093;visibility:visible;mso-wrap-style:square;v-text-anchor:middle" arcsize="10923f" o:gfxdata="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" fillcolor="white [3201]" strokecolor="black [3200]" strokeweight="1pt">
+                <v:roundrect id="Rectangle: Rounded Corners 9" o:spid="_x0000_s1031" style="position:absolute;left:1047;top:9069;width:63608;height:74093;visibility:visible;mso-wrap-style:square;v-text-anchor:middle" arcsize="10923f" o:gfxdata="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" fillcolor="white [3201]" strokecolor="black [3200]" strokeweight="1pt">
                   <v:stroke joinstyle="miter"/>
                   <v:textbox>
                     <w:txbxContent>
@@ -1174,10 +1389,10 @@
                     </w:txbxContent>
                   </v:textbox>
                 </v:roundrect>
-                <v:roundrect id="Rectangle: Rounded Corners 10" o:spid="_x0000_s1031" style="position:absolute;left:5143;top:14751;width:55340;height:62014;visibility:visible;mso-wrap-style:square;v-text-anchor:middle" arcsize="10923f" o:gfxdata="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" fillcolor="#d9e2f3 [660]" strokecolor="#1f3763 [1604]" strokeweight="1pt">
+                <v:roundrect id="Rectangle: Rounded Corners 10" o:spid="_x0000_s1032" style="position:absolute;left:5143;top:14751;width:55340;height:62014;visibility:visible;mso-wrap-style:square;v-text-anchor:middle" arcsize="10923f" o:gfxdata="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" fillcolor="#d9e2f3 [660]" strokecolor="#1f3763 [1604]" strokeweight="1pt">
                   <v:stroke joinstyle="miter"/>
                 </v:roundrect>
-                <v:roundrect id="Rectangle: Rounded Corners 11" o:spid="_x0000_s1032" style="position:absolute;left:8667;top:18804;width:48673;height:9921;visibility:visible;mso-wrap-style:square;v-text-anchor:middle" arcsize="10923f" o:gfxdata="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" fillcolor="#f3a875 [2165]" strokecolor="#ed7d31 [3205]" strokeweight=".5pt">
+                <v:roundrect id="Rectangle: Rounded Corners 11" o:spid="_x0000_s1033" style="position:absolute;left:8667;top:18804;width:48673;height:9921;visibility:visible;mso-wrap-style:square;v-text-anchor:middle" arcsize="10923f" o:gfxdata="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" fillcolor="#f3a875 [2165]" strokecolor="#ed7d31 [3205]" strokeweight=".5pt">
                   <v:fill color2="#f09558 [2613]" rotate="t" colors="0 #f7bda4;.5 #f5b195;1 #f8a581" focus="100%" type="gradient">
                     <o:fill v:ext="view" type="gradientUnscaled"/>
                   </v:fill>
@@ -1272,10 +1487,10 @@
                     </w:txbxContent>
                   </v:textbox>
                 </v:roundrect>
-                <v:roundrect id="Rectangle: Rounded Corners 12" o:spid="_x0000_s1033" style="position:absolute;left:9048;top:34284;width:48006;height:21627;visibility:visible;mso-wrap-style:square;v-text-anchor:middle" arcsize="10923f" o:gfxdata="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" fillcolor="white [3212]" strokecolor="#1f3763 [1604]" strokeweight="1pt">
+                <v:roundrect id="Rectangle: Rounded Corners 12" o:spid="_x0000_s1034" style="position:absolute;left:9048;top:34284;width:48006;height:21627;visibility:visible;mso-wrap-style:square;v-text-anchor:middle" arcsize="10923f" o:gfxdata="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" fillcolor="white [3212]" strokecolor="#1f3763 [1604]" strokeweight="1pt">
                   <v:stroke joinstyle="miter"/>
                 </v:roundrect>
-                <v:roundrect id="Rectangle: Rounded Corners 13" o:spid="_x0000_s1034" style="position:absolute;left:12847;top:39603;width:18764;height:11613;visibility:visible;mso-wrap-style:square;v-text-anchor:middle" arcsize="10923f" o:gfxdata="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" fillcolor="#fbe4d5 [661]" strokecolor="#1f3763 [1604]" strokeweight="1pt">
+                <v:roundrect id="Rectangle: Rounded Corners 13" o:spid="_x0000_s1035" style="position:absolute;left:12847;top:39603;width:18764;height:11613;visibility:visible;mso-wrap-style:square;v-text-anchor:middle" arcsize="10923f" o:gfxdata="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" fillcolor="#fbe4d5 [661]" strokecolor="#1f3763 [1604]" strokeweight="1pt">
                   <v:stroke joinstyle="miter"/>
                   <v:textbox>
                     <w:txbxContent>
@@ -1383,13 +1598,31 @@
                               <w14:round/>
                             </w14:textOutline>
                           </w:rPr>
-                          <w:t>Port: 8080, localhost</w:t>
+                          <w:t xml:space="preserve">Port: 8080, </w:t>
+                        </w:r>
+                        <w:r>
+                          <w:rPr>
+                            <w:b/>
+                            <w:bCs/>
+                            <w:color w:val="000000" w:themeColor="text1"/>
+                            <w14:shadow w14:blurRad="38100" w14:dist="19050" w14:dir="2700000" w14:sx="100000" w14:sy="100000" w14:kx="0" w14:ky="0" w14:algn="tl">
+                              <w14:schemeClr w14:val="dk1">
+                                <w14:alpha w14:val="60000"/>
+                              </w14:schemeClr>
+                            </w14:shadow>
+                            <w14:textOutline w14:w="0" w14:cap="flat" w14:cmpd="sng" w14:algn="ctr">
+                              <w14:noFill/>
+                              <w14:prstDash w14:val="solid"/>
+                              <w14:round/>
+                            </w14:textOutline>
+                          </w:rPr>
+                          <w:t>localhost</w:t>
                         </w:r>
                       </w:p>
                     </w:txbxContent>
                   </v:textbox>
                 </v:roundrect>
-                <v:roundrect id="Rectangle: Rounded Corners 14" o:spid="_x0000_s1035" style="position:absolute;left:36090;top:39772;width:18764;height:11608;visibility:visible;mso-wrap-style:square;v-text-anchor:middle" arcsize="10923f" o:gfxdata="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" fillcolor="#fbe4d5 [661]" strokecolor="#1f3763 [1604]" strokeweight="1pt">
+                <v:roundrect id="Rectangle: Rounded Corners 14" o:spid="_x0000_s1036" style="position:absolute;left:36090;top:39772;width:18764;height:11608;visibility:visible;mso-wrap-style:square;v-text-anchor:middle" arcsize="10923f" o:gfxdata="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" fillcolor="#fbe4d5 [661]" strokecolor="#1f3763 [1604]" strokeweight="1pt">
                   <v:stroke joinstyle="miter"/>
                   <v:textbox>
                     <w:txbxContent>
@@ -1525,7 +1758,7 @@
                     </w:txbxContent>
                   </v:textbox>
                 </v:roundrect>
-                <v:roundrect id="Rectangle: Rounded Corners 16" o:spid="_x0000_s1036" style="position:absolute;left:12953;top:58745;width:18289;height:7442;visibility:visible;mso-wrap-style:square;v-text-anchor:middle" arcsize="10923f" o:gfxdata="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" fillcolor="white [3201]" strokecolor="#70ad47 [3209]" strokeweight="1pt">
+                <v:roundrect id="Rectangle: Rounded Corners 16" o:spid="_x0000_s1037" style="position:absolute;left:13040;top:59220;width:18288;height:9633;visibility:visible;mso-wrap-style:square;v-text-anchor:middle" arcsize="10923f" o:gfxdata="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" fillcolor="white [3201]" strokecolor="#70ad47 [3209]" strokeweight="1pt">
                   <v:stroke joinstyle="miter"/>
                   <v:textbox>
                     <w:txbxContent>
@@ -1564,7 +1797,7 @@
                     </w:txbxContent>
                   </v:textbox>
                 </v:roundrect>
-                <v:roundrect id="Rectangle: Rounded Corners 17" o:spid="_x0000_s1037" style="position:absolute;left:37491;top:59475;width:18288;height:7436;visibility:visible;mso-wrap-style:square;v-text-anchor:middle" arcsize="10923f" o:gfxdata="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" fillcolor="white [3201]" strokecolor="#70ad47 [3209]" strokeweight="1pt">
+                <v:roundrect id="Rectangle: Rounded Corners 17" o:spid="_x0000_s1038" style="position:absolute;left:37491;top:59470;width:18288;height:9196;visibility:visible;mso-wrap-style:square;v-text-anchor:middle" arcsize="10923f" o:gfxdata="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" fillcolor="white [3201]" strokecolor="#70ad47 [3209]" strokeweight="1pt">
                   <v:stroke joinstyle="miter"/>
                   <v:textbox>
                     <w:txbxContent>
@@ -1591,11 +1824,22 @@
                         <w:r>
                           <w:t>SSM for Exec</w:t>
                         </w:r>
+                        <w:r>
+                          <w:t xml:space="preserve"> </w:t>
+                        </w:r>
+                      </w:p>
+                      <w:p>
+                        <w:pPr>
+                          <w:jc w:val="center"/>
+                        </w:pPr>
+                        <w:r>
+                          <w:t xml:space="preserve">Least </w:t>
+                        </w:r>
                       </w:p>
                     </w:txbxContent>
                   </v:textbox>
                 </v:roundrect>
-                <v:roundrect id="Rectangle: Rounded Corners 18" o:spid="_x0000_s1038" style="position:absolute;left:10191;top:285;width:19050;height:6483;visibility:visible;mso-wrap-style:square;v-text-anchor:middle" arcsize="10923f" o:gfxdata="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" fillcolor="#e7e6e6 [3214]" strokecolor="#1f3763 [1604]" strokeweight="1pt">
+                <v:roundrect id="Rectangle: Rounded Corners 18" o:spid="_x0000_s1039" style="position:absolute;left:10191;top:285;width:19050;height:6483;visibility:visible;mso-wrap-style:square;v-text-anchor:middle" arcsize="10923f" o:gfxdata="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" fillcolor="#e7e6e6 [3214]" strokecolor="#1f3763 [1604]" strokeweight="1pt">
                   <v:stroke joinstyle="miter"/>
                   <v:textbox>
                     <w:txbxContent>
@@ -1651,7 +1895,19 @@
                           <w:rPr>
                             <w:color w:val="4472C4" w:themeColor="accent1"/>
                           </w:rPr>
-                          <w:t>taskcount</w:t>
+                          <w:t>task</w:t>
+                        </w:r>
+                        <w:r>
+                          <w:rPr>
+                            <w:color w:val="4472C4" w:themeColor="accent1"/>
+                          </w:rPr>
+                          <w:t>C</w:t>
+                        </w:r>
+                        <w:r>
+                          <w:rPr>
+                            <w:color w:val="4472C4" w:themeColor="accent1"/>
+                          </w:rPr>
+                          <w:t>ount</w:t>
                         </w:r>
                         <w:proofErr w:type="spellEnd"/>
                       </w:p>
@@ -1662,17 +1918,28 @@
                   <v:path arrowok="t" fillok="f" o:connecttype="none"/>
                   <o:lock v:ext="edit" shapetype="t"/>
                 </v:shapetype>
-                <v:shape id="Straight Arrow Connector 20" o:spid="_x0000_s1039" type="#_x0000_t32" style="position:absolute;left:19713;top:6768;width:3;height:2300;flip:x;visibility:visible;mso-wrap-style:square" o:connectortype="straight" o:gfxdata="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" strokecolor="#4472c4 [3204]" strokeweight=".5pt">
+                <v:shape id="Straight Arrow Connector 20" o:spid="_x0000_s1040" type="#_x0000_t32" style="position:absolute;left:19713;top:6768;width:3;height:2300;flip:x;visibility:visible;mso-wrap-style:square" o:connectortype="straight" o:gfxdata="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" strokecolor="#4472c4 [3204]" strokeweight=".5pt">
                   <v:stroke endarrow="block" joinstyle="miter"/>
                 </v:shape>
-                <v:shape id="Straight Arrow Connector 21" o:spid="_x0000_s1040" type="#_x0000_t32" style="position:absolute;left:33004;top:28725;width:47;height:5559;visibility:visible;mso-wrap-style:square" o:connectortype="straight" o:gfxdata="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" strokecolor="#4472c4 [3204]" strokeweight=".5pt">
+                <v:shape id="Straight Arrow Connector 21" o:spid="_x0000_s1041" type="#_x0000_t32" style="position:absolute;left:33004;top:28725;width:47;height:5559;visibility:visible;mso-wrap-style:square" o:connectortype="straight" o:gfxdata="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" strokecolor="#4472c4 [3204]" strokeweight=".5pt">
                   <v:stroke endarrow="block" joinstyle="miter"/>
                 </v:shape>
-                <v:shape id="Straight Arrow Connector 22" o:spid="_x0000_s1041" type="#_x0000_t32" style="position:absolute;left:31527;top:45403;width:4563;height:173;visibility:visible;mso-wrap-style:square" o:connectortype="straight" o:gfxdata="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" strokecolor="#4472c4 [3204]" strokeweight=".5pt">
+                <v:shape id="Straight Arrow Connector 22" o:spid="_x0000_s1042" type="#_x0000_t32" style="position:absolute;left:31527;top:45403;width:4563;height:173;visibility:visible;mso-wrap-style:square" o:connectortype="straight" o:gfxdata="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" strokecolor="#4472c4 [3204]" strokeweight=".5pt">
                   <v:stroke endarrow="block" joinstyle="miter"/>
                 </v:shape>
-                <v:shape id="Straight Arrow Connector 23" o:spid="_x0000_s1042" type="#_x0000_t32" style="position:absolute;left:45482;top:50228;width:0;height:8911;visibility:visible;mso-wrap-style:square" o:connectortype="straight" o:gfxdata="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" strokecolor="#4472c4 [3204]" strokeweight=".5pt">
+                <v:shape id="Straight Arrow Connector 23" o:spid="_x0000_s1043" type="#_x0000_t32" style="position:absolute;left:45482;top:50228;width:0;height:8911;visibility:visible;mso-wrap-style:square" o:connectortype="straight" o:gfxdata="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" strokecolor="#4472c4 [3204]" strokeweight=".5pt">
                   <v:stroke endarrow="block" joinstyle="miter"/>
+                </v:shape>
+                <v:shape id="Text Box 29" o:spid="_x0000_s1044" type="#_x0000_t202" style="position:absolute;left:42010;top:53233;width:5887;height:2489;visibility:visible;mso-wrap-style:none;v-text-anchor:top" o:gfxdata="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" fillcolor="white [3201]" strokeweight=".5pt">
+                  <v:textbox>
+                    <w:txbxContent>
+                      <w:p>
+                        <w:r>
+                          <w:t>To RDS</w:t>
+                        </w:r>
+                      </w:p>
+                    </w:txbxContent>
+                  </v:textbox>
                 </v:shape>
                 <w10:anchorlock/>
               </v:group>
@@ -2089,7 +2356,7 @@
   <w:style w:type="paragraph" w:default="1" w:styleId="Normal">
     <w:name w:val="Normal"/>
     <w:qFormat/>
-    <w:rsid w:val="00D84FAD"/>
+    <w:rsid w:val="00B443AE"/>
   </w:style>
   <w:style w:type="character" w:default="1" w:styleId="DefaultParagraphFont">
     <w:name w:val="Default Paragraph Font"/>

</xml_diff>